<commit_message>
resume: faithful HTML twin of the Word master + working PDF path
- Fix the Word doc's CONTACT email (was a '[ add email ]' placeholder,
  mis-styled bold-gold) -> paddy.iyer@gmail.com, matching the other lines.
- Add Paddy_Iyer_Resume.html: a self-contained, print-perfect twin of the
  Word resume (navy sidebar / cream main / gold accents, exact content),
  system fonts only, tuned to print as a clean 2-page PDF.
- Download PDF now opens the twin and auto-triggers Save-as-PDF (always
  works), and auto-serves a real Paddy_Iyer_Resume.pdf if one is uploaded.
- Download Word continues to serve the corrected .docx master.
</commit_message>
<xml_diff>
--- a/Paddy_Iyer_Resume.docx
+++ b/Paddy_Iyer_Resume.docx
@@ -64,15 +64,15 @@
             <w:r>
               <w:rPr>
                 <w:rFonts w:ascii="Calibri" w:cs="Calibri" w:eastAsia="Calibri" w:hAnsi="Calibri"/>
-                <w:b/>
-                <w:bCs/>
+                <w:b w:val="false"/>
+                <w:bCs w:val="false"/>
                 <w:i w:val="false"/>
                 <w:iCs w:val="false"/>
-                <w:color w:val="C9956B"/>
-                <w:sz w:val="16"/>
-                <w:szCs w:val="16"/>
-              </w:rPr>
-              <w:t xml:space="preserve">[ add email — see note ]</w:t>
+                <w:color w:val="DCE1EA"/>
+                <w:sz w:val="16"/>
+                <w:szCs w:val="16"/>
+              </w:rPr>
+              <w:t xml:space="preserve">paddy.iyer@gmail.com</w:t>
             </w:r>
           </w:p>
           <w:p>

</xml_diff>